<commit_message>
Republish Week 8 (Rich Tasks) — weekly instrument model
- outlines + rich-task.docx refreshed to the human-first model (FPP
  cold-test -> NRICH compare -> Alkimi last; two-reads reflection;
  verbatim Alkimi prompt in the assignment)
- remove retired task-assembler.html
check-week.sh: PASS
</commit_message>
<xml_diff>
--- a/week-8-rich-tasks/week-8-rich-task.docx
+++ b/week-8-rich-tasks/week-8-rich-task.docx
@@ -1,17 +1,22 @@
 
 <file path=word/document.xml><?xml version="1.0" encoding="utf-8"?>
-<w:document xmlns:o="urn:schemas-microsoft-com:office:office" xmlns:r="http://schemas.openxmlformats.org/officeDocument/2006/relationships" xmlns:v="urn:schemas-microsoft-com:vml" xmlns:w="http://schemas.openxmlformats.org/wordprocessingml/2006/main" xmlns:w10="urn:schemas-microsoft-com:office:word" xmlns:wp="http://schemas.openxmlformats.org/drawingml/2006/wordprocessingDrawing" xmlns:pic="http://schemas.openxmlformats.org/drawingml/2006/picture" xmlns:wps="http://schemas.microsoft.com/office/word/2010/wordprocessingShape" xmlns:wpg="http://schemas.microsoft.com/office/word/2010/wordprocessingGroup" xmlns:mc="http://schemas.openxmlformats.org/markup-compatibility/2006" xmlns:wp14="http://schemas.microsoft.com/office/word/2010/wordprocessingDrawing" xmlns:w14="http://schemas.microsoft.com/office/word/2010/wordml" xmlns:w15="http://schemas.microsoft.com/office/word/2012/wordml" mc:Ignorable="w14 wp14 w15">
+<w:document xmlns:wpc="http://schemas.microsoft.com/office/word/2010/wordprocessingCanvas" xmlns:mc="http://schemas.openxmlformats.org/markup-compatibility/2006" xmlns:o="urn:schemas-microsoft-com:office:office" xmlns:r="http://schemas.openxmlformats.org/officeDocument/2006/relationships" xmlns:m="http://schemas.openxmlformats.org/officeDocument/2006/math" xmlns:v="urn:schemas-microsoft-com:vml" xmlns:wp14="http://schemas.microsoft.com/office/word/2010/wordprocessingDrawing" xmlns:wp="http://schemas.openxmlformats.org/drawingml/2006/wordprocessingDrawing" xmlns:w10="urn:schemas-microsoft-com:office:word" xmlns:w="http://schemas.openxmlformats.org/wordprocessingml/2006/main" xmlns:w14="http://schemas.microsoft.com/office/word/2010/wordml" xmlns:w15="http://schemas.microsoft.com/office/word/2012/wordml" xmlns:w16se="http://schemas.microsoft.com/office/word/2015/wordml/symex" xmlns:w16cid="http://schemas.microsoft.com/office/word/2016/wordml/cid" xmlns:w16="http://schemas.microsoft.com/office/word/2018/wordml" xmlns:w16cex="http://schemas.microsoft.com/office/word/2018/wordml/cex" xmlns:w16sdtdh="http://schemas.microsoft.com/office/word/2020/wordml/sdtdatahash" xmlns:wne="http://schemas.microsoft.com/office/word/2006/wordml" xmlns:wpg="http://schemas.microsoft.com/office/word/2010/wordprocessingGroup" xmlns:wps="http://schemas.microsoft.com/office/word/2010/wordprocessingShape" mc:Ignorable="w14 w15 w16se w16cid w16 w16cex w16sdtdh wp14">
   <w:body>
     <w:p>
       <w:pPr>
         <w:pStyle w:val="Normal"/>
-        <w:spacing w:lineRule="auto" w:line="240" w:before="0" w:after="0"/>
-        <w:rPr/>
+        <w:spacing w:before="0" w:after="0" w:line="240" w:lineRule="auto"/>
+        <w:jc w:val="start"/>
       </w:pPr>
       <w:r>
         <w:rPr>
+          <w:rFonts w:ascii="Calibri" w:hAnsi="Calibri" w:eastAsia="ＭＳ 明朝" w:cs="Calibri"/>
           <w:b/>
+          <w:bCs/>
+          <w:color w:val="1F2933"/>
+          <w:kern w:val="0"/>
           <w:sz w:val="28"/>
+          <w:szCs w:val="22"/>
         </w:rPr>
         <w:t>Rich Task — Making Understanding Visible</w:t>
       </w:r>
@@ -19,13 +24,18 @@
     <w:p>
       <w:pPr>
         <w:pStyle w:val="Normal"/>
-        <w:spacing w:lineRule="auto" w:line="240" w:before="0" w:after="0"/>
-        <w:rPr/>
+        <w:spacing w:before="0" w:after="0" w:line="240" w:lineRule="auto"/>
+        <w:jc w:val="start"/>
       </w:pPr>
       <w:r>
         <w:rPr>
+          <w:rFonts w:ascii="Calibri" w:hAnsi="Calibri" w:eastAsia="ＭＳ 明朝" w:cs="Calibri"/>
           <w:b/>
+          <w:bCs/>
+          <w:color w:val="1F2933"/>
+          <w:kern w:val="0"/>
           <w:sz w:val="28"/>
+          <w:szCs w:val="22"/>
         </w:rPr>
         <w:t>Week 8 · TCE 318P FA26 (Edwards)</w:t>
       </w:r>
@@ -33,13 +43,18 @@
     <w:p>
       <w:pPr>
         <w:pStyle w:val="Normal"/>
-        <w:spacing w:lineRule="auto" w:line="240" w:before="0" w:after="0"/>
-        <w:rPr/>
+        <w:spacing w:before="0" w:after="0" w:line="240" w:lineRule="auto"/>
+        <w:jc w:val="start"/>
       </w:pPr>
       <w:r>
         <w:rPr>
+          <w:rFonts w:ascii="Calibri" w:hAnsi="Calibri" w:eastAsia="ＭＳ 明朝" w:cs="Calibri"/>
           <w:b/>
+          <w:bCs/>
+          <w:color w:val="1F2933"/>
+          <w:kern w:val="0"/>
           <w:sz w:val="28"/>
+          <w:szCs w:val="22"/>
         </w:rPr>
         <w:t>25 points possible</w:t>
       </w:r>
@@ -47,13 +62,18 @@
     <w:p>
       <w:pPr>
         <w:pStyle w:val="Normal"/>
-        <w:spacing w:lineRule="auto" w:line="240" w:before="120" w:after="0"/>
-        <w:rPr/>
+        <w:spacing w:before="120" w:after="0" w:line="240" w:lineRule="auto"/>
+        <w:jc w:val="start"/>
       </w:pPr>
       <w:r>
         <w:rPr>
+          <w:rFonts w:ascii="Calibri" w:hAnsi="Calibri" w:eastAsia="ＭＳ 明朝" w:cs="Calibri"/>
           <w:b/>
+          <w:bCs/>
+          <w:color w:val="1F2933"/>
+          <w:kern w:val="0"/>
           <w:sz w:val="24"/>
+          <w:szCs w:val="22"/>
         </w:rPr>
         <w:t>1. What's This All About?</w:t>
       </w:r>
@@ -61,209 +81,312 @@
     <w:p>
       <w:pPr>
         <w:pStyle w:val="Normal"/>
-        <w:spacing w:lineRule="auto" w:line="240" w:before="0" w:after="0"/>
-        <w:rPr/>
+        <w:spacing w:before="0" w:after="0" w:line="240" w:lineRule="auto"/>
+        <w:jc w:val="start"/>
       </w:pPr>
       <w:r>
-        <w:rPr/>
+        <w:rPr>
+          <w:rFonts w:ascii="Calibri" w:hAnsi="Calibri" w:eastAsia="ＭＳ 明朝" w:cs="Calibri"/>
+          <w:color w:val="1F2933"/>
+          <w:kern w:val="0"/>
+          <w:sz w:val="22"/>
+          <w:szCs w:val="22"/>
+        </w:rPr>
         <w:t>Your research question asks how one learner understands a piece of mathematics. Now you build the instrument that lets you find out: a rich task, the During of your nested lesson. Its job is to make your learner's understanding of your concept visible, so the work they produce becomes evidence you can analyze. Most of your Case Study evidence will come from what your learner does with this task.</w:t>
       </w:r>
     </w:p>
     <w:p>
       <w:pPr>
         <w:pStyle w:val="Normal"/>
-        <w:spacing w:lineRule="auto" w:line="240" w:before="0" w:after="0"/>
-        <w:rPr/>
-      </w:pPr>
-      <w:r>
-        <w:rPr/>
-      </w:r>
+        <w:spacing w:before="0" w:after="0" w:line="240" w:lineRule="auto"/>
+        <w:jc w:val="start"/>
+      </w:pPr>
+      <w:r/>
     </w:p>
     <w:p>
       <w:pPr>
         <w:pStyle w:val="Normal"/>
-        <w:spacing w:lineRule="auto" w:line="240" w:before="0" w:after="0"/>
-        <w:rPr/>
+        <w:spacing w:before="0" w:after="0" w:line="240" w:lineRule="auto"/>
+        <w:jc w:val="start"/>
       </w:pPr>
       <w:r>
-        <w:rPr/>
+        <w:rPr>
+          <w:rFonts w:ascii="Calibri" w:hAnsi="Calibri" w:eastAsia="ＭＳ 明朝" w:cs="Calibri"/>
+          <w:color w:val="1F2933"/>
+          <w:kern w:val="0"/>
+          <w:sz w:val="22"/>
+          <w:szCs w:val="22"/>
+        </w:rPr>
         <w:t>This is not “find any problem.”</w:t>
       </w:r>
     </w:p>
     <w:p>
       <w:pPr>
         <w:pStyle w:val="Normal"/>
-        <w:spacing w:lineRule="auto" w:line="240" w:before="0" w:after="0"/>
-        <w:rPr/>
-      </w:pPr>
-      <w:r>
-        <w:rPr/>
-      </w:r>
+        <w:spacing w:before="0" w:after="0" w:line="240" w:lineRule="auto"/>
+        <w:jc w:val="start"/>
+      </w:pPr>
+      <w:r/>
     </w:p>
     <w:p>
       <w:pPr>
         <w:pStyle w:val="Normal"/>
-        <w:spacing w:lineRule="auto" w:line="240" w:before="0" w:after="0"/>
-        <w:rPr/>
+        <w:spacing w:before="0" w:after="0" w:line="240" w:lineRule="auto"/>
+        <w:jc w:val="start"/>
       </w:pPr>
       <w:r>
-        <w:rPr/>
+        <w:rPr>
+          <w:rFonts w:ascii="Calibri" w:hAnsi="Calibri" w:eastAsia="ＭＳ 明朝" w:cs="Calibri"/>
+          <w:color w:val="1F2933"/>
+          <w:kern w:val="0"/>
+          <w:sz w:val="22"/>
+          <w:szCs w:val="22"/>
+        </w:rPr>
         <w:t>A rich task has specific characteristics, and yours must genuinely have them:</w:t>
       </w:r>
     </w:p>
     <w:p>
       <w:pPr>
         <w:pStyle w:val="ListBullet"/>
+        <w:contextualSpacing/>
         <w:numPr>
           <w:ilvl w:val="0"/>
           <w:numId w:val="1"/>
         </w:numPr>
-        <w:spacing w:lineRule="auto" w:line="240" w:before="0" w:after="0"/>
-        <w:contextualSpacing/>
-        <w:rPr/>
+        <w:spacing w:before="0" w:after="0" w:line="240" w:lineRule="auto"/>
+        <w:ind w:left="360" w:hanging="360"/>
+        <w:jc w:val="start"/>
       </w:pPr>
       <w:r>
         <w:rPr>
+          <w:rFonts w:ascii="Calibri" w:hAnsi="Calibri" w:eastAsia="ＭＳ 明朝" w:cs="Calibri"/>
           <w:b/>
+          <w:bCs/>
+          <w:color w:val="1F2933"/>
+          <w:kern w:val="0"/>
+          <w:sz w:val="22"/>
+          <w:szCs w:val="22"/>
         </w:rPr>
         <w:t>Worthwhile mathematics.</w:t>
       </w:r>
       <w:r>
-        <w:rPr/>
+        <w:rPr>
+          <w:rFonts w:ascii="Calibri" w:hAnsi="Calibri" w:eastAsia="ＭＳ 明朝" w:cs="Calibri"/>
+          <w:color w:val="1F2933"/>
+          <w:kern w:val="0"/>
+          <w:sz w:val="22"/>
+          <w:szCs w:val="22"/>
+        </w:rPr>
         <w:t xml:space="preserve"> It targets a significant concept (your standard), not a trick or a one-step skill.</w:t>
       </w:r>
     </w:p>
     <w:p>
       <w:pPr>
         <w:pStyle w:val="ListBullet"/>
+        <w:contextualSpacing/>
         <w:numPr>
           <w:ilvl w:val="0"/>
           <w:numId w:val="1"/>
         </w:numPr>
-        <w:spacing w:lineRule="auto" w:line="240" w:before="0" w:after="0"/>
-        <w:contextualSpacing/>
-        <w:rPr/>
+        <w:spacing w:before="0" w:after="0" w:line="240" w:lineRule="auto"/>
+        <w:ind w:left="360" w:hanging="360"/>
+        <w:jc w:val="start"/>
       </w:pPr>
       <w:r>
         <w:rPr>
+          <w:rFonts w:ascii="Calibri" w:hAnsi="Calibri" w:eastAsia="ＭＳ 明朝" w:cs="Calibri"/>
           <w:b/>
+          <w:bCs/>
+          <w:color w:val="1F2933"/>
+          <w:kern w:val="0"/>
+          <w:sz w:val="22"/>
+          <w:szCs w:val="22"/>
         </w:rPr>
         <w:t>Open to learners</w:t>
       </w:r>
       <w:r>
-        <w:rPr/>
+        <w:rPr>
+          <w:rFonts w:ascii="Calibri" w:hAnsi="Calibri" w:eastAsia="ＭＳ 明朝" w:cs="Calibri"/>
+          <w:color w:val="1F2933"/>
+          <w:kern w:val="0"/>
+          <w:sz w:val="22"/>
+          <w:szCs w:val="22"/>
+        </w:rPr>
         <w:t xml:space="preserve"> (low floor, high ceiling). Your learner can get in, and it still holds real depth.</w:t>
       </w:r>
     </w:p>
     <w:p>
       <w:pPr>
         <w:pStyle w:val="ListBullet"/>
+        <w:contextualSpacing/>
         <w:numPr>
           <w:ilvl w:val="0"/>
           <w:numId w:val="1"/>
         </w:numPr>
-        <w:spacing w:lineRule="auto" w:line="240" w:before="0" w:after="0"/>
-        <w:contextualSpacing/>
-        <w:rPr/>
+        <w:spacing w:before="0" w:after="0" w:line="240" w:lineRule="auto"/>
+        <w:ind w:left="360" w:hanging="360"/>
+        <w:jc w:val="start"/>
       </w:pPr>
       <w:r>
         <w:rPr>
+          <w:rFonts w:ascii="Calibri" w:hAnsi="Calibri" w:eastAsia="ＭＳ 明朝" w:cs="Calibri"/>
           <w:b/>
+          <w:bCs/>
+          <w:color w:val="1F2933"/>
+          <w:kern w:val="0"/>
+          <w:sz w:val="22"/>
+          <w:szCs w:val="22"/>
         </w:rPr>
         <w:t>Open to strategies.</w:t>
       </w:r>
       <w:r>
-        <w:rPr/>
+        <w:rPr>
+          <w:rFonts w:ascii="Calibri" w:hAnsi="Calibri" w:eastAsia="ＭＳ 明朝" w:cs="Calibri"/>
+          <w:color w:val="1F2933"/>
+          <w:kern w:val="0"/>
+          <w:sz w:val="22"/>
+          <w:szCs w:val="22"/>
+        </w:rPr>
         <w:t xml:space="preserve"> It can be solved in genuinely different ways, with different representations (a diagram, a table, a number line, symbols).</w:t>
       </w:r>
     </w:p>
     <w:p>
       <w:pPr>
         <w:pStyle w:val="ListBullet"/>
+        <w:contextualSpacing/>
         <w:numPr>
           <w:ilvl w:val="0"/>
           <w:numId w:val="1"/>
         </w:numPr>
-        <w:spacing w:lineRule="auto" w:line="240" w:before="0" w:after="0"/>
-        <w:contextualSpacing/>
-        <w:rPr/>
+        <w:spacing w:before="0" w:after="0" w:line="240" w:lineRule="auto"/>
+        <w:ind w:left="360" w:hanging="360"/>
+        <w:jc w:val="start"/>
       </w:pPr>
       <w:r>
         <w:rPr>
+          <w:rFonts w:ascii="Calibri" w:hAnsi="Calibri" w:eastAsia="ＭＳ 明朝" w:cs="Calibri"/>
           <w:b/>
+          <w:bCs/>
+          <w:color w:val="1F2933"/>
+          <w:kern w:val="0"/>
+          <w:sz w:val="22"/>
+          <w:szCs w:val="22"/>
         </w:rPr>
         <w:t>Demands reasoning.</w:t>
       </w:r>
       <w:r>
-        <w:rPr/>
+        <w:rPr>
+          <w:rFonts w:ascii="Calibri" w:hAnsi="Calibri" w:eastAsia="ＭＳ 明朝" w:cs="Calibri"/>
+          <w:color w:val="1F2933"/>
+          <w:kern w:val="0"/>
+          <w:sz w:val="22"/>
+          <w:szCs w:val="22"/>
+        </w:rPr>
         <w:t xml:space="preserve"> It asks students to show or justify their thinking, not just give an answer, so how they think becomes visible.</w:t>
       </w:r>
     </w:p>
     <w:p>
       <w:pPr>
         <w:pStyle w:val="ListBullet"/>
+        <w:contextualSpacing/>
         <w:numPr>
           <w:ilvl w:val="0"/>
           <w:numId w:val="1"/>
         </w:numPr>
-        <w:spacing w:lineRule="auto" w:line="240" w:before="0" w:after="0"/>
-        <w:contextualSpacing/>
-        <w:rPr/>
+        <w:spacing w:before="0" w:after="0" w:line="240" w:lineRule="auto"/>
+        <w:ind w:left="360" w:hanging="360"/>
+        <w:jc w:val="start"/>
       </w:pPr>
       <w:r>
         <w:rPr>
+          <w:rFonts w:ascii="Calibri" w:hAnsi="Calibri" w:eastAsia="ＭＳ 明朝" w:cs="Calibri"/>
           <w:b/>
+          <w:bCs/>
+          <w:color w:val="1F2933"/>
+          <w:kern w:val="0"/>
+          <w:sz w:val="22"/>
+          <w:szCs w:val="22"/>
         </w:rPr>
         <w:t>Cognitively demanding.</w:t>
       </w:r>
       <w:r>
-        <w:rPr/>
+        <w:rPr>
+          <w:rFonts w:ascii="Calibri" w:hAnsi="Calibri" w:eastAsia="ＭＳ 明朝" w:cs="Calibri"/>
+          <w:color w:val="1F2933"/>
+          <w:kern w:val="0"/>
+          <w:sz w:val="22"/>
+          <w:szCs w:val="22"/>
+        </w:rPr>
         <w:t xml:space="preserve"> It can't be answered by a memorized procedure; it makes students actually do mathematics.</w:t>
       </w:r>
     </w:p>
     <w:p>
       <w:pPr>
         <w:pStyle w:val="ListBullet"/>
+        <w:contextualSpacing/>
         <w:numPr>
           <w:ilvl w:val="0"/>
           <w:numId w:val="1"/>
         </w:numPr>
-        <w:spacing w:lineRule="auto" w:line="240" w:before="0" w:after="0"/>
-        <w:contextualSpacing/>
-        <w:rPr/>
+        <w:spacing w:before="0" w:after="0" w:line="240" w:lineRule="auto"/>
+        <w:ind w:left="360" w:hanging="360"/>
+        <w:jc w:val="start"/>
       </w:pPr>
       <w:r>
         <w:rPr>
+          <w:rFonts w:ascii="Calibri" w:hAnsi="Calibri" w:eastAsia="ＭＳ 明朝" w:cs="Calibri"/>
           <w:b/>
+          <w:bCs/>
+          <w:color w:val="1F2933"/>
+          <w:kern w:val="0"/>
+          <w:sz w:val="22"/>
+          <w:szCs w:val="22"/>
         </w:rPr>
         <w:t>Extendable.</w:t>
       </w:r>
       <w:r>
-        <w:rPr/>
+        <w:rPr>
+          <w:rFonts w:ascii="Calibri" w:hAnsi="Calibri" w:eastAsia="ＭＳ 明朝" w:cs="Calibri"/>
+          <w:color w:val="1F2933"/>
+          <w:kern w:val="0"/>
+          <w:sz w:val="22"/>
+          <w:szCs w:val="22"/>
+        </w:rPr>
         <w:t xml:space="preserve"> There is a “what if…?”; it can be pushed further.</w:t>
       </w:r>
     </w:p>
     <w:p>
       <w:pPr>
         <w:pStyle w:val="Normal"/>
-        <w:spacing w:lineRule="auto" w:line="240" w:before="0" w:after="0"/>
-        <w:rPr/>
+        <w:spacing w:before="0" w:after="0" w:line="240" w:lineRule="auto"/>
+        <w:jc w:val="start"/>
       </w:pPr>
       <w:r>
-        <w:rPr/>
-        <w:t>The test of richness: if you cannot solve your task in at least three genuinely different ways, it is not rich yet. Keep building.</w:t>
+        <w:rPr>
+          <w:rFonts w:ascii="Calibri" w:hAnsi="Calibri" w:eastAsia="ＭＳ 明朝" w:cs="Calibri"/>
+          <w:color w:val="1F2933"/>
+          <w:kern w:val="0"/>
+          <w:sz w:val="22"/>
+          <w:szCs w:val="22"/>
+        </w:rPr>
+        <w:t>The test of richness: if your task cannot be solved in at least three genuinely different ways, it is not rich yet. Keep building.</w:t>
       </w:r>
     </w:p>
     <w:p>
       <w:pPr>
         <w:pStyle w:val="Normal"/>
-        <w:spacing w:lineRule="auto" w:line="240" w:before="120" w:after="0"/>
-        <w:rPr/>
+        <w:spacing w:before="120" w:after="0" w:line="240" w:lineRule="auto"/>
+        <w:jc w:val="start"/>
       </w:pPr>
       <w:r>
         <w:rPr>
+          <w:rFonts w:ascii="Calibri" w:hAnsi="Calibri" w:eastAsia="ＭＳ 明朝" w:cs="Calibri"/>
           <w:b/>
+          <w:bCs/>
+          <w:color w:val="1F2933"/>
+          <w:kern w:val="0"/>
           <w:sz w:val="24"/>
+          <w:szCs w:val="22"/>
         </w:rPr>
         <w:t>2. What Do I Need to Do?</w:t>
       </w:r>
@@ -271,120 +394,240 @@
     <w:p>
       <w:pPr>
         <w:pStyle w:val="Normal"/>
-        <w:spacing w:lineRule="auto" w:line="240" w:before="0" w:after="0"/>
-        <w:rPr/>
+        <w:spacing w:before="0" w:after="0" w:line="240" w:lineRule="auto"/>
+        <w:jc w:val="start"/>
       </w:pPr>
       <w:r>
-        <w:rPr/>
-        <w:t>You developed your task and solved it three ways in class. To finish and submit the assignment:</w:t>
+        <w:rPr>
+          <w:rFonts w:ascii="Calibri" w:hAnsi="Calibri" w:eastAsia="ＭＳ 明朝" w:cs="Calibri"/>
+          <w:color w:val="1F2933"/>
+          <w:kern w:val="0"/>
+          <w:sz w:val="22"/>
+          <w:szCs w:val="22"/>
+        </w:rPr>
+        <w:t>Your task begins in class. This assignment is where you test it, finish it, and submit it.</w:t>
       </w:r>
     </w:p>
     <w:p>
       <w:pPr>
+        <w:pStyle w:val="Normal"/>
+        <w:spacing w:before="120" w:after="0" w:line="240" w:lineRule="auto"/>
+        <w:jc w:val="start"/>
+      </w:pPr>
+      <w:r>
+        <w:rPr>
+          <w:rFonts w:ascii="Calibri" w:hAnsi="Calibri" w:eastAsia="ＭＳ 明朝" w:cs="Calibri"/>
+          <w:b/>
+          <w:bCs/>
+          <w:color w:val="1F2933"/>
+          <w:kern w:val="0"/>
+          <w:sz w:val="22"/>
+          <w:szCs w:val="22"/>
+        </w:rPr>
+        <w:t>Tuesday</w:t>
+      </w:r>
+    </w:p>
+    <w:p>
+      <w:pPr>
         <w:pStyle w:val="ListNumber"/>
+        <w:contextualSpacing/>
         <w:numPr>
           <w:ilvl w:val="0"/>
           <w:numId w:val="4"/>
         </w:numPr>
-        <w:spacing w:lineRule="auto" w:line="240" w:before="0" w:after="0"/>
-        <w:contextualSpacing/>
-        <w:rPr/>
+        <w:spacing w:before="0" w:after="0" w:line="240" w:lineRule="auto"/>
+        <w:ind w:left="360" w:hanging="360"/>
+        <w:jc w:val="start"/>
       </w:pPr>
       <w:r>
-        <w:rPr/>
-        <w:t>Open TaskAssembler.</w:t>
+        <w:rPr>
+          <w:rFonts w:ascii="Calibri" w:hAnsi="Calibri" w:eastAsia="ＭＳ 明朝" w:cs="Calibri"/>
+          <w:color w:val="1F2933"/>
+          <w:kern w:val="0"/>
+          <w:sz w:val="22"/>
+          <w:szCs w:val="22"/>
+        </w:rPr>
+        <w:t>Find a rich task that could help answer your research question — one that could make your learner's thinking visible. NRICH is a good place to look. (If you have a research partner, find one task together.) Be ready to pose it on Thursday.</w:t>
       </w:r>
     </w:p>
     <w:p>
       <w:pPr>
+        <w:pStyle w:val="Normal"/>
+        <w:spacing w:before="120" w:after="0" w:line="240" w:lineRule="auto"/>
+        <w:jc w:val="start"/>
+      </w:pPr>
+      <w:r>
+        <w:rPr>
+          <w:rFonts w:ascii="Calibri" w:hAnsi="Calibri" w:eastAsia="ＭＳ 明朝" w:cs="Calibri"/>
+          <w:b/>
+          <w:bCs/>
+          <w:color w:val="1F2933"/>
+          <w:kern w:val="0"/>
+          <w:sz w:val="22"/>
+          <w:szCs w:val="22"/>
+        </w:rPr>
+        <w:t>Thursday</w:t>
+      </w:r>
+    </w:p>
+    <w:p>
+      <w:pPr>
         <w:pStyle w:val="ListNumber"/>
+        <w:contextualSpacing/>
         <w:numPr>
           <w:ilvl w:val="0"/>
           <w:numId w:val="4"/>
         </w:numPr>
-        <w:spacing w:lineRule="auto" w:line="240" w:before="0" w:after="0"/>
-        <w:contextualSpacing/>
-        <w:rPr/>
+        <w:spacing w:before="0" w:after="0" w:line="240" w:lineRule="auto"/>
+        <w:ind w:left="360" w:hanging="360"/>
+        <w:jc w:val="start"/>
       </w:pPr>
       <w:r>
-        <w:rPr/>
-        <w:t>Enter your research question, your task, the three ways you solved the task, and where you predict your learner might get stuck.</w:t>
+        <w:rPr>
+          <w:rFonts w:ascii="Calibri" w:hAnsi="Calibri" w:eastAsia="ＭＳ 明朝" w:cs="Calibri"/>
+          <w:color w:val="1F2933"/>
+          <w:kern w:val="0"/>
+          <w:sz w:val="22"/>
+          <w:szCs w:val="22"/>
+        </w:rPr>
+        <w:t>You will be matched with your Field Prep Partner(s) — a classmate or classmates who have not seen your task. Pose it, and let them solve it cold while you watch. Do not rescue or hint. Photograph their work; you will need it.</w:t>
       </w:r>
     </w:p>
     <w:p>
       <w:pPr>
         <w:pStyle w:val="ListNumber"/>
+        <w:contextualSpacing/>
         <w:numPr>
           <w:ilvl w:val="0"/>
           <w:numId w:val="4"/>
         </w:numPr>
-        <w:spacing w:lineRule="auto" w:line="240" w:before="0" w:after="0"/>
-        <w:contextualSpacing/>
-        <w:rPr/>
+        <w:spacing w:before="0" w:after="0" w:line="240" w:lineRule="auto"/>
+        <w:ind w:left="360" w:hanging="360"/>
+        <w:jc w:val="start"/>
       </w:pPr>
       <w:r>
-        <w:rPr/>
-        <w:t>Share your responses with Alkimi, using the PDF that TaskAssembler produces.</w:t>
+        <w:rPr>
+          <w:rFonts w:ascii="Calibri" w:hAnsi="Calibri" w:eastAsia="ＭＳ 明朝" w:cs="Calibri"/>
+          <w:color w:val="1F2933"/>
+          <w:kern w:val="0"/>
+          <w:sz w:val="22"/>
+          <w:szCs w:val="22"/>
+        </w:rPr>
+        <w:t>Look together at how your partner(s) solved it and at the published (NRICH) solutions. Pull out three genuinely different solution strategies for your task, and note where real solvers surprised you. Ask your partner(s): is the task genuinely rich, and does it fit your research question? Capture their feedback.</w:t>
       </w:r>
     </w:p>
     <w:p>
       <w:pPr>
         <w:pStyle w:val="ListNumber"/>
+        <w:contextualSpacing/>
         <w:numPr>
           <w:ilvl w:val="0"/>
           <w:numId w:val="4"/>
         </w:numPr>
-        <w:spacing w:lineRule="auto" w:line="240" w:before="0" w:after="0"/>
-        <w:contextualSpacing/>
-        <w:rPr/>
+        <w:spacing w:before="0" w:after="0" w:line="240" w:lineRule="auto"/>
+        <w:ind w:left="360" w:hanging="360"/>
+        <w:jc w:val="start"/>
       </w:pPr>
       <w:r>
-        <w:rPr/>
-        <w:t>Read Alkimi's feedback, and revise your task or research question if the feedback makes that seem worthwhile.</w:t>
+        <w:rPr>
+          <w:rFonts w:ascii="Calibri" w:hAnsi="Calibri" w:eastAsia="ＭＳ 明朝" w:cs="Calibri"/>
+          <w:color w:val="1F2933"/>
+          <w:kern w:val="0"/>
+          <w:sz w:val="22"/>
+          <w:szCs w:val="22"/>
+        </w:rPr>
+        <w:t>Then take your task to Alkimi. Paste in your task, the grade level, and your research question, and give it the prompt (</w:t>
+      </w:r>
+      <w:r>
+        <w:rPr>
+          <w:rFonts w:ascii="Calibri" w:hAnsi="Calibri" w:eastAsia="ＭＳ 明朝" w:cs="Calibri"/>
+          <w:i/>
+          <w:iCs/>
+          <w:color w:val="1F2933"/>
+          <w:kern w:val="0"/>
+          <w:sz w:val="22"/>
+          <w:szCs w:val="22"/>
+        </w:rPr>
+        <w:t>see next page, below our scoring rubric</w:t>
+      </w:r>
+      <w:r>
+        <w:rPr>
+          <w:rFonts w:ascii="Calibri" w:hAnsi="Calibri" w:eastAsia="ＭＳ 明朝" w:cs="Calibri"/>
+          <w:color w:val="1F2933"/>
+          <w:kern w:val="0"/>
+          <w:sz w:val="22"/>
+          <w:szCs w:val="22"/>
+        </w:rPr>
+        <w:t>). Read what it says, and keep a screenshot.</w:t>
       </w:r>
     </w:p>
     <w:p>
       <w:pPr>
-        <w:pStyle w:val="ListNumber"/>
-        <w:numPr>
-          <w:ilvl w:val="0"/>
-          <w:numId w:val="4"/>
-        </w:numPr>
-        <w:spacing w:lineRule="auto" w:line="240" w:before="0" w:after="0"/>
-        <w:contextualSpacing/>
-        <w:rPr/>
+        <w:pStyle w:val="Normal"/>
+        <w:spacing w:before="120" w:after="0" w:line="240" w:lineRule="auto"/>
+        <w:jc w:val="start"/>
       </w:pPr>
       <w:r>
-        <w:rPr/>
-        <w:t>Take a screenshot of Alkimi's feedback. In a second document, discuss how you used it to revise your research question or task.</w:t>
+        <w:rPr>
+          <w:rFonts w:ascii="Calibri" w:hAnsi="Calibri" w:eastAsia="ＭＳ 明朝" w:cs="Calibri"/>
+          <w:b/>
+          <w:bCs/>
+          <w:color w:val="1F2933"/>
+          <w:kern w:val="0"/>
+          <w:sz w:val="22"/>
+          <w:szCs w:val="22"/>
+        </w:rPr>
+        <w:t>Homework</w:t>
       </w:r>
     </w:p>
     <w:p>
       <w:pPr>
-        <w:pStyle w:val="ListNumber"/>
-        <w:numPr>
-          <w:ilvl w:val="0"/>
-          <w:numId w:val="4"/>
-        </w:numPr>
-        <w:spacing w:lineRule="auto" w:line="240" w:before="0" w:after="0"/>
-        <w:contextualSpacing/>
-        <w:rPr/>
+        <w:pStyle w:val="Normal"/>
+        <w:spacing w:before="0" w:after="0" w:line="240" w:lineRule="auto"/>
+        <w:jc w:val="start"/>
       </w:pPr>
       <w:r>
-        <w:rPr/>
-        <w:t>Submit both documents in Canvas by the deadline: (1) the PDF that TaskAssembler produced, and (2) your reflection on Alkimi's feedback, as a second PDF.</w:t>
+        <w:rPr>
+          <w:rFonts w:ascii="Calibri" w:hAnsi="Calibri" w:eastAsia="ＭＳ 明朝" w:cs="Calibri"/>
+          <w:color w:val="1F2933"/>
+          <w:kern w:val="0"/>
+          <w:sz w:val="22"/>
+          <w:szCs w:val="22"/>
+        </w:rPr>
+        <w:t>Revise your task in light of both reads — your partner(s)' solving and feedback, and Alkimi's check. In a paragraph, discuss how each improved the task, with specifics.</w:t>
       </w:r>
     </w:p>
     <w:p>
       <w:pPr>
         <w:pStyle w:val="Normal"/>
-        <w:spacing w:lineRule="auto" w:line="240" w:before="120" w:after="0"/>
-        <w:rPr/>
+        <w:spacing w:before="120" w:after="0" w:line="240" w:lineRule="auto"/>
+        <w:jc w:val="start"/>
+      </w:pPr>
+    </w:p>
+    <w:p>
+      <w:pPr>
+        <w:pageBreakBefore/>
+        <w:spacing w:line="240" w:lineRule="auto"/>
+        <w:jc w:val="start"/>
+      </w:pPr>
+      <w:r>
+        <w:lastRenderedPageBreak/>
+      </w:r>
+    </w:p>
+    <w:p>
+      <w:pPr>
+        <w:pStyle w:val="Normal"/>
+        <w:spacing w:before="120" w:after="0" w:line="240" w:lineRule="auto"/>
+        <w:jc w:val="start"/>
       </w:pPr>
       <w:r>
         <w:rPr>
+          <w:rFonts w:ascii="Calibri" w:hAnsi="Calibri" w:eastAsia="ＭＳ 明朝" w:cs="Calibri"/>
           <w:b/>
+          <w:bCs/>
+          <w:color w:val="1F2933"/>
+          <w:kern w:val="0"/>
           <w:sz w:val="24"/>
+          <w:szCs w:val="22"/>
         </w:rPr>
         <w:t>3. Length &amp; Format</w:t>
       </w:r>
@@ -392,73 +635,119 @@
     <w:p>
       <w:pPr>
         <w:pStyle w:val="Normal"/>
-        <w:spacing w:lineRule="auto" w:line="240" w:before="0" w:after="0"/>
-        <w:rPr/>
+        <w:spacing w:before="0" w:after="0" w:line="240" w:lineRule="auto"/>
+        <w:jc w:val="start"/>
       </w:pPr>
       <w:r>
-        <w:rPr/>
-        <w:t>Two documents, submitted in Canvas as PDFs:</w:t>
+        <w:rPr>
+          <w:rFonts w:ascii="Calibri" w:hAnsi="Calibri" w:eastAsia="ＭＳ 明朝" w:cs="Calibri"/>
+          <w:color w:val="1F2933"/>
+          <w:kern w:val="0"/>
+          <w:sz w:val="22"/>
+          <w:szCs w:val="22"/>
+        </w:rPr>
+        <w:t>Two documents, submitted in Canvas as a single (combined) PDF or two separate PDFs:</w:t>
       </w:r>
     </w:p>
     <w:p>
       <w:pPr>
         <w:pStyle w:val="ListBullet"/>
+        <w:contextualSpacing/>
         <w:numPr>
           <w:ilvl w:val="0"/>
           <w:numId w:val="1"/>
         </w:numPr>
-        <w:spacing w:lineRule="auto" w:line="240" w:before="0" w:after="0"/>
-        <w:contextualSpacing/>
-        <w:rPr/>
+        <w:spacing w:before="0" w:after="0" w:line="240" w:lineRule="auto"/>
+        <w:ind w:left="360" w:hanging="360"/>
+        <w:jc w:val="start"/>
       </w:pPr>
       <w:r>
         <w:rPr>
+          <w:rFonts w:ascii="Calibri" w:hAnsi="Calibri" w:eastAsia="ＭＳ 明朝" w:cs="Calibri"/>
           <w:b/>
+          <w:bCs/>
+          <w:color w:val="1F2933"/>
+          <w:kern w:val="0"/>
+          <w:sz w:val="22"/>
+          <w:szCs w:val="22"/>
         </w:rPr>
         <w:t>Document 1:</w:t>
       </w:r>
       <w:r>
-        <w:rPr/>
-        <w:t xml:space="preserve"> the PDF produced by TaskAssembler. Your research question, your task, your three solutions, and where you predict your learner might get stuck (with any images).</w:t>
+        <w:rPr>
+          <w:rFonts w:ascii="Calibri" w:hAnsi="Calibri" w:eastAsia="ＭＳ 明朝" w:cs="Calibri"/>
+          <w:color w:val="1F2933"/>
+          <w:kern w:val="0"/>
+          <w:sz w:val="22"/>
+          <w:szCs w:val="22"/>
+        </w:rPr>
+        <w:t xml:space="preserve"> your task. An Introduction with your original task, then your revised task, the three solution strategies you gathered, and where you predict your learner might get stuck (with any images).</w:t>
       </w:r>
     </w:p>
     <w:p>
       <w:pPr>
         <w:pStyle w:val="ListBullet"/>
+        <w:contextualSpacing/>
         <w:numPr>
           <w:ilvl w:val="0"/>
           <w:numId w:val="1"/>
         </w:numPr>
-        <w:spacing w:lineRule="auto" w:line="240" w:before="0" w:after="0"/>
-        <w:contextualSpacing/>
-        <w:rPr/>
+        <w:spacing w:before="0" w:after="0" w:line="240" w:lineRule="auto"/>
+        <w:ind w:left="360" w:hanging="360"/>
+        <w:jc w:val="start"/>
       </w:pPr>
       <w:r>
         <w:rPr>
+          <w:rFonts w:ascii="Calibri" w:hAnsi="Calibri" w:eastAsia="ＭＳ 明朝" w:cs="Calibri"/>
           <w:b/>
+          <w:bCs/>
+          <w:color w:val="1F2933"/>
+          <w:kern w:val="0"/>
+          <w:sz w:val="22"/>
+          <w:szCs w:val="22"/>
         </w:rPr>
         <w:t>Document 2:</w:t>
       </w:r>
       <w:r>
-        <w:rPr/>
-        <w:t xml:space="preserve"> your reflection. A screenshot of Alkimi's feedback, and a discussion of how you used it to revise your task or research question.</w:t>
+        <w:rPr>
+          <w:rFonts w:ascii="Calibri" w:hAnsi="Calibri" w:eastAsia="ＭＳ 明朝" w:cs="Calibri"/>
+          <w:color w:val="1F2933"/>
+          <w:kern w:val="0"/>
+          <w:sz w:val="22"/>
+          <w:szCs w:val="22"/>
+        </w:rPr>
+        <w:t xml:space="preserve"> your two-reads reflection. How your Field Prep Partner(s) solved the task (with an image of their work), what their feedback and the NRICH comparison showed, then Alkimi's richness check (with a screenshot), and how both reads improved your task. Human first, then Alkimi.</w:t>
       </w:r>
     </w:p>
     <w:p>
       <w:pPr>
         <w:pStyle w:val="Normal"/>
-        <w:spacing w:lineRule="auto" w:line="240" w:before="0" w:after="0"/>
-        <w:rPr/>
+        <w:spacing w:before="0" w:after="0" w:line="240" w:lineRule="auto"/>
+        <w:jc w:val="start"/>
       </w:pPr>
       <w:r>
-        <w:rPr/>
+        <w:rPr>
+          <w:rFonts w:ascii="Calibri" w:hAnsi="Calibri" w:eastAsia="ＭＳ 明朝" w:cs="Calibri"/>
+          <w:color w:val="1F2933"/>
+          <w:kern w:val="0"/>
+          <w:sz w:val="22"/>
+          <w:szCs w:val="22"/>
+        </w:rPr>
         <w:t>Pseudonym only. No student names or identifying details anywhere (FERPA).</w:t>
       </w:r>
     </w:p>
     <w:p>
       <w:pPr>
         <w:pStyle w:val="Normal"/>
-        <w:spacing w:lineRule="auto" w:line="240" w:before="120" w:after="0"/>
+        <w:spacing w:line="240" w:lineRule="auto"/>
+        <w:jc w:val="start"/>
+      </w:pPr>
+    </w:p>
+    <w:p>
+      <w:pPr>
+        <w:pStyle w:val="Normal"/>
+        <w:spacing w:before="120" w:after="0" w:line="240" w:lineRule="auto"/>
+        <w:jc w:val="start"/>
         <w:rPr>
           <w:b/>
           <w:sz w:val="24"/>
@@ -466,27 +755,13 @@
       </w:pPr>
       <w:r>
         <w:rPr>
+          <w:rFonts w:ascii="Calibri" w:hAnsi="Calibri" w:eastAsia="ＭＳ 明朝" w:cs="Calibri"/>
           <w:b/>
+          <w:bCs/>
+          <w:color w:val="1F2933"/>
+          <w:kern w:val="0"/>
           <w:sz w:val="24"/>
-        </w:rPr>
-      </w:r>
-      <w:r>
-        <w:br w:type="page"/>
-      </w:r>
-    </w:p>
-    <w:p>
-      <w:pPr>
-        <w:pStyle w:val="Normal"/>
-        <w:spacing w:lineRule="auto" w:line="240" w:before="120" w:after="0"/>
-        <w:rPr>
-          <w:b/>
-          <w:sz w:val="24"/>
-        </w:rPr>
-      </w:pPr>
-      <w:r>
-        <w:rPr>
-          <w:b/>
-          <w:sz w:val="24"/>
+          <w:szCs w:val="22"/>
         </w:rPr>
         <w:t>4. Working Collaboratively</w:t>
       </w:r>
@@ -494,35 +769,127 @@
     <w:p>
       <w:pPr>
         <w:pStyle w:val="Normal"/>
-        <w:spacing w:lineRule="auto" w:line="240" w:before="0" w:after="0"/>
-        <w:rPr/>
+        <w:spacing w:before="0" w:after="0" w:line="240" w:lineRule="auto"/>
+        <w:jc w:val="start"/>
       </w:pPr>
       <w:r>
-        <w:rPr/>
+        <w:rPr>
+          <w:rFonts w:ascii="Calibri" w:hAnsi="Calibri" w:eastAsia="ＭＳ 明朝" w:cs="Calibri"/>
+          <w:color w:val="1F2933"/>
+          <w:kern w:val="0"/>
+          <w:sz w:val="22"/>
+          <w:szCs w:val="22"/>
+        </w:rPr>
         <w:t>The task is yours, designed for your learner and aimed at your question. You will workshop tasks with classmates and can borrow ideas, but the task you submit and defend is built for your child.</w:t>
       </w:r>
     </w:p>
     <w:p>
       <w:pPr>
         <w:pStyle w:val="Normal"/>
-        <w:spacing w:lineRule="auto" w:line="240" w:before="0" w:after="0"/>
-        <w:rPr/>
+        <w:spacing w:before="0" w:after="0" w:line="240" w:lineRule="auto"/>
+        <w:jc w:val="start"/>
       </w:pPr>
       <w:r>
-        <w:rPr/>
-        <w:t>Alkimi is a critic: it evaluates your task against these characteristics and points at what to fix. It does not design it for you. The design judgment is yours.</w:t>
+        <w:rPr>
+          <w:rFonts w:ascii="Calibri" w:hAnsi="Calibri" w:eastAsia="ＭＳ 明朝" w:cs="Calibri"/>
+          <w:color w:val="1F2933"/>
+          <w:kern w:val="0"/>
+          <w:sz w:val="22"/>
+          <w:szCs w:val="22"/>
+        </w:rPr>
+        <w:t>If you have a research partner, the two of you design and defend the task together. Your Field Prep Partner(s) are different people — the ones who test it, not build it.</w:t>
       </w:r>
     </w:p>
     <w:p>
       <w:pPr>
         <w:pStyle w:val="Normal"/>
-        <w:spacing w:lineRule="auto" w:line="240" w:before="120" w:after="0"/>
-        <w:rPr/>
+        <w:numPr>
+          <w:ilvl w:val="0"/>
+          <w:numId w:val="1"/>
+        </w:numPr>
+        <w:spacing w:before="0" w:after="0" w:line="240" w:lineRule="auto"/>
+        <w:ind w:left="360" w:hanging="360"/>
+        <w:jc w:val="start"/>
       </w:pPr>
       <w:r>
         <w:rPr>
+          <w:rFonts w:ascii="Calibri" w:hAnsi="Calibri" w:eastAsia="ＭＳ 明朝" w:cs="Calibri"/>
           <w:b/>
+          <w:bCs/>
+          <w:color w:val="1F2933"/>
+          <w:kern w:val="0"/>
+          <w:sz w:val="22"/>
+          <w:szCs w:val="22"/>
+        </w:rPr>
+        <w:t>Human first:</w:t>
+      </w:r>
+      <w:r>
+        <w:rPr>
+          <w:rFonts w:ascii="Calibri" w:hAnsi="Calibri" w:eastAsia="ＭＳ 明朝" w:cs="Calibri"/>
+          <w:color w:val="1F2933"/>
+          <w:kern w:val="0"/>
+          <w:sz w:val="22"/>
+          <w:szCs w:val="22"/>
+        </w:rPr>
+        <w:t xml:space="preserve"> your Field Prep Partner(s) test your task before Alkimi does. You bring what you learn from them to Alkimi, not the other way around. Both test your design; neither one makes it for you.</w:t>
+      </w:r>
+    </w:p>
+    <w:p>
+      <w:pPr>
+        <w:pStyle w:val="Normal"/>
+        <w:numPr>
+          <w:ilvl w:val="0"/>
+          <w:numId w:val="1"/>
+        </w:numPr>
+        <w:spacing w:before="0" w:after="0" w:line="240" w:lineRule="auto"/>
+        <w:ind w:left="360" w:hanging="360"/>
+        <w:jc w:val="start"/>
+      </w:pPr>
+      <w:r>
+        <w:rPr>
+          <w:rFonts w:ascii="Calibri" w:hAnsi="Calibri" w:eastAsia="ＭＳ 明朝" w:cs="Calibri"/>
+          <w:b/>
+          <w:bCs/>
+          <w:color w:val="1F2933"/>
+          <w:kern w:val="0"/>
+          <w:sz w:val="22"/>
+          <w:szCs w:val="22"/>
+        </w:rPr>
+        <w:t>Alkimi is a critic:</w:t>
+      </w:r>
+      <w:r>
+        <w:rPr>
+          <w:rFonts w:ascii="Calibri" w:hAnsi="Calibri" w:eastAsia="ＭＳ 明朝" w:cs="Calibri"/>
+          <w:color w:val="1F2933"/>
+          <w:kern w:val="0"/>
+          <w:sz w:val="22"/>
+          <w:szCs w:val="22"/>
+        </w:rPr>
+        <w:t xml:space="preserve"> it evaluates your task against these characteristics and points at what to fix. It does not design it for you. The design judgment is yours.</w:t>
+      </w:r>
+    </w:p>
+    <w:p>
+      <w:pPr>
+        <w:pStyle w:val="Normal"/>
+        <w:spacing w:before="0" w:after="0" w:line="240" w:lineRule="auto"/>
+        <w:jc w:val="start"/>
+      </w:pPr>
+    </w:p>
+    <w:p>
+      <w:pPr>
+        <w:pStyle w:val="Normal"/>
+        <w:spacing w:before="120" w:after="0" w:line="240" w:lineRule="auto"/>
+        <w:jc w:val="start"/>
+      </w:pPr>
+      <w:r>
+        <w:rPr>
+          <w:rFonts w:ascii="Calibri" w:hAnsi="Calibri" w:eastAsia="ＭＳ 明朝" w:cs="Calibri"/>
+          <w:b/>
+          <w:bCs/>
+          <w:color w:val="1F2933"/>
+          <w:kern w:val="0"/>
           <w:sz w:val="24"/>
+          <w:szCs w:val="22"/>
         </w:rPr>
         <w:t>5. How Is My Work Being Assessed?</w:t>
       </w:r>
@@ -531,27 +898,46 @@
       <w:tblPr>
         <w:tblStyle w:val="TableGrid"/>
         <w:tblW w:w="9471" w:type="dxa"/>
-        <w:jc w:val="start"/>
+        <w:jc w:val="left"/>
         <w:tblInd w:w="177" w:type="dxa"/>
+        <w:tblBorders>
+          <w:top w:val="single" w:sz="4" w:space="0" w:color="auto"/>
+          <w:left w:val="single" w:sz="4" w:space="0" w:color="auto"/>
+          <w:bottom w:val="single" w:sz="4" w:space="0" w:color="auto"/>
+          <w:right w:val="single" w:sz="4" w:space="0" w:color="auto"/>
+          <w:insideH w:val="single" w:sz="4" w:space="0" w:color="auto"/>
+          <w:insideV w:val="single" w:sz="4" w:space="0" w:color="auto"/>
+        </w:tblBorders>
         <w:tblLayout w:type="fixed"/>
         <w:tblCellMar>
           <w:top w:w="0" w:type="dxa"/>
-          <w:start w:w="108" w:type="dxa"/>
+          <w:left w:w="108" w:type="dxa"/>
           <w:bottom w:w="0" w:type="dxa"/>
-          <w:end w:w="108" w:type="dxa"/>
+          <w:right w:w="108" w:type="dxa"/>
         </w:tblCellMar>
-        <w:tblLook w:noHBand="0" w:noVBand="1" w:firstColumn="1" w:lastRow="0" w:lastColumn="0" w:firstRow="1" w:val="04a0"/>
+        <w:tblLook w:firstRow="1" w:firstColumn="1" w:noVBand="1"/>
       </w:tblPr>
       <w:tblGrid>
         <w:gridCol w:w="1800"/>
         <w:gridCol w:w="7671"/>
       </w:tblGrid>
       <w:tr>
-        <w:trPr/>
         <w:tc>
           <w:tcPr>
             <w:tcW w:w="1800" w:type="dxa"/>
-            <w:tcBorders/>
+            <w:tcBorders>
+              <w:top w:val="single" w:sz="4" w:space="0" w:color="auto"/>
+              <w:left w:val="single" w:sz="4" w:space="0" w:color="auto"/>
+              <w:bottom w:val="single" w:sz="4" w:space="0" w:color="auto"/>
+              <w:right w:val="single" w:sz="4" w:space="0" w:color="auto"/>
+            </w:tcBorders>
+            <w:shd w:val="clear" w:fill="CCCCCC"/>
+            <w:tcMar>
+              <w:top w:w="0" w:type="dxa"/>
+              <w:left w:w="108" w:type="dxa"/>
+              <w:bottom w:w="0" w:type="dxa"/>
+              <w:right w:w="108" w:type="dxa"/>
+            </w:tcMar>
           </w:tcPr>
           <w:p>
             <w:pPr>
@@ -559,20 +945,20 @@
               <w:widowControl/>
               <w:jc w:val="start"/>
               <w:rPr>
-                <w:rFonts w:eastAsia="ＭＳ 明朝" w:cs=""/>
+                <w:rFonts w:eastAsia="ＭＳ 明朝"/>
                 <w:kern w:val="0"/>
                 <w:szCs w:val="22"/>
-                <w:lang w:val="en-US" w:eastAsia="en-US" w:bidi="ar-SA"/>
               </w:rPr>
             </w:pPr>
             <w:r>
               <w:rPr>
-                <w:rFonts w:eastAsia="ＭＳ 明朝" w:cs=""/>
+                <w:rFonts w:ascii="Calibri" w:hAnsi="Calibri" w:eastAsia="ＭＳ 明朝" w:cs="Calibri"/>
                 <w:b/>
+                <w:bCs/>
+                <w:color w:val="1F2933"/>
                 <w:kern w:val="0"/>
                 <w:sz w:val="21"/>
                 <w:szCs w:val="22"/>
-                <w:lang w:val="en-US" w:eastAsia="en-US" w:bidi="ar-SA"/>
               </w:rPr>
               <w:t>Criteria</w:t>
             </w:r>
@@ -581,7 +967,19 @@
         <w:tc>
           <w:tcPr>
             <w:tcW w:w="7671" w:type="dxa"/>
-            <w:tcBorders/>
+            <w:tcBorders>
+              <w:top w:val="single" w:sz="4" w:space="0" w:color="auto"/>
+              <w:left w:val="single" w:sz="4" w:space="0" w:color="auto"/>
+              <w:bottom w:val="single" w:sz="4" w:space="0" w:color="auto"/>
+              <w:right w:val="single" w:sz="4" w:space="0" w:color="auto"/>
+            </w:tcBorders>
+            <w:shd w:val="clear" w:fill="CCCCCC"/>
+            <w:tcMar>
+              <w:top w:w="0" w:type="dxa"/>
+              <w:left w:w="108" w:type="dxa"/>
+              <w:bottom w:w="0" w:type="dxa"/>
+              <w:right w:w="108" w:type="dxa"/>
+            </w:tcMar>
           </w:tcPr>
           <w:p>
             <w:pPr>
@@ -589,20 +987,20 @@
               <w:widowControl/>
               <w:jc w:val="start"/>
               <w:rPr>
-                <w:rFonts w:eastAsia="ＭＳ 明朝" w:cs=""/>
+                <w:rFonts w:eastAsia="ＭＳ 明朝"/>
                 <w:kern w:val="0"/>
                 <w:szCs w:val="22"/>
-                <w:lang w:val="en-US" w:eastAsia="en-US" w:bidi="ar-SA"/>
               </w:rPr>
             </w:pPr>
             <w:r>
               <w:rPr>
-                <w:rFonts w:eastAsia="ＭＳ 明朝" w:cs=""/>
+                <w:rFonts w:ascii="Calibri" w:hAnsi="Calibri" w:eastAsia="ＭＳ 明朝" w:cs="Calibri"/>
                 <w:b/>
+                <w:bCs/>
+                <w:color w:val="1F2933"/>
                 <w:kern w:val="0"/>
                 <w:sz w:val="21"/>
                 <w:szCs w:val="22"/>
-                <w:lang w:val="en-US" w:eastAsia="en-US" w:bidi="ar-SA"/>
               </w:rPr>
               <w:t>Expectations</w:t>
             </w:r>
@@ -610,11 +1008,21 @@
         </w:tc>
       </w:tr>
       <w:tr>
-        <w:trPr/>
         <w:tc>
           <w:tcPr>
             <w:tcW w:w="1800" w:type="dxa"/>
-            <w:tcBorders/>
+            <w:tcBorders>
+              <w:top w:val="single" w:sz="4" w:space="0" w:color="auto"/>
+              <w:left w:val="single" w:sz="4" w:space="0" w:color="auto"/>
+              <w:bottom w:val="single" w:sz="4" w:space="0" w:color="auto"/>
+              <w:right w:val="single" w:sz="4" w:space="0" w:color="auto"/>
+            </w:tcBorders>
+            <w:tcMar>
+              <w:top w:w="0" w:type="dxa"/>
+              <w:left w:w="108" w:type="dxa"/>
+              <w:bottom w:w="0" w:type="dxa"/>
+              <w:right w:w="108" w:type="dxa"/>
+            </w:tcMar>
           </w:tcPr>
           <w:p>
             <w:pPr>
@@ -622,20 +1030,20 @@
               <w:widowControl/>
               <w:jc w:val="start"/>
               <w:rPr>
-                <w:rFonts w:eastAsia="ＭＳ 明朝" w:cs=""/>
+                <w:rFonts w:eastAsia="ＭＳ 明朝"/>
                 <w:kern w:val="0"/>
                 <w:szCs w:val="22"/>
-                <w:lang w:val="en-US" w:eastAsia="en-US" w:bidi="ar-SA"/>
               </w:rPr>
             </w:pPr>
             <w:r>
               <w:rPr>
-                <w:rFonts w:eastAsia="ＭＳ 明朝" w:cs=""/>
+                <w:rFonts w:ascii="Calibri" w:hAnsi="Calibri" w:eastAsia="ＭＳ 明朝" w:cs="Calibri"/>
                 <w:b/>
+                <w:bCs/>
+                <w:color w:val="1F2933"/>
                 <w:kern w:val="0"/>
                 <w:sz w:val="21"/>
                 <w:szCs w:val="22"/>
-                <w:lang w:val="en-US" w:eastAsia="en-US" w:bidi="ar-SA"/>
               </w:rPr>
               <w:t>Worthwhile &amp; anchored (5)</w:t>
             </w:r>
@@ -644,7 +1052,18 @@
         <w:tc>
           <w:tcPr>
             <w:tcW w:w="7671" w:type="dxa"/>
-            <w:tcBorders/>
+            <w:tcBorders>
+              <w:top w:val="single" w:sz="4" w:space="0" w:color="auto"/>
+              <w:left w:val="single" w:sz="4" w:space="0" w:color="auto"/>
+              <w:bottom w:val="single" w:sz="4" w:space="0" w:color="auto"/>
+              <w:right w:val="single" w:sz="4" w:space="0" w:color="auto"/>
+            </w:tcBorders>
+            <w:tcMar>
+              <w:top w:w="0" w:type="dxa"/>
+              <w:left w:w="108" w:type="dxa"/>
+              <w:bottom w:w="0" w:type="dxa"/>
+              <w:right w:w="108" w:type="dxa"/>
+            </w:tcMar>
           </w:tcPr>
           <w:p>
             <w:pPr>
@@ -652,20 +1071,18 @@
               <w:widowControl/>
               <w:jc w:val="start"/>
               <w:rPr>
-                <w:rFonts w:eastAsia="ＭＳ 明朝" w:cs=""/>
+                <w:rFonts w:eastAsia="ＭＳ 明朝"/>
                 <w:kern w:val="0"/>
                 <w:szCs w:val="22"/>
-                <w:lang w:val="en-US" w:eastAsia="en-US" w:bidi="ar-SA"/>
               </w:rPr>
             </w:pPr>
             <w:r>
               <w:rPr>
-                <w:rFonts w:eastAsia="ＭＳ 明朝" w:cs=""/>
-                <w:b w:val="false"/>
+                <w:rFonts w:ascii="Calibri" w:hAnsi="Calibri" w:eastAsia="ＭＳ 明朝" w:cs="Calibri"/>
+                <w:color w:val="1F2933"/>
                 <w:kern w:val="0"/>
                 <w:sz w:val="21"/>
                 <w:szCs w:val="22"/>
-                <w:lang w:val="en-US" w:eastAsia="en-US" w:bidi="ar-SA"/>
               </w:rPr>
               <w:t>Targets a significant concept and Ohio standard at the heart of your research question. Real mathematics, not a trick or a one-step skill.</w:t>
             </w:r>
@@ -673,11 +1090,21 @@
         </w:tc>
       </w:tr>
       <w:tr>
-        <w:trPr/>
         <w:tc>
           <w:tcPr>
             <w:tcW w:w="1800" w:type="dxa"/>
-            <w:tcBorders/>
+            <w:tcBorders>
+              <w:top w:val="single" w:sz="4" w:space="0" w:color="auto"/>
+              <w:left w:val="single" w:sz="4" w:space="0" w:color="auto"/>
+              <w:bottom w:val="single" w:sz="4" w:space="0" w:color="auto"/>
+              <w:right w:val="single" w:sz="4" w:space="0" w:color="auto"/>
+            </w:tcBorders>
+            <w:tcMar>
+              <w:top w:w="0" w:type="dxa"/>
+              <w:left w:w="108" w:type="dxa"/>
+              <w:bottom w:w="0" w:type="dxa"/>
+              <w:right w:w="108" w:type="dxa"/>
+            </w:tcMar>
           </w:tcPr>
           <w:p>
             <w:pPr>
@@ -685,20 +1112,20 @@
               <w:widowControl/>
               <w:jc w:val="start"/>
               <w:rPr>
-                <w:rFonts w:eastAsia="ＭＳ 明朝" w:cs=""/>
+                <w:rFonts w:eastAsia="ＭＳ 明朝"/>
                 <w:kern w:val="0"/>
                 <w:szCs w:val="22"/>
-                <w:lang w:val="en-US" w:eastAsia="en-US" w:bidi="ar-SA"/>
               </w:rPr>
             </w:pPr>
             <w:r>
               <w:rPr>
-                <w:rFonts w:eastAsia="ＭＳ 明朝" w:cs=""/>
+                <w:rFonts w:ascii="Calibri" w:hAnsi="Calibri" w:eastAsia="ＭＳ 明朝" w:cs="Calibri"/>
                 <w:b/>
+                <w:bCs/>
+                <w:color w:val="1F2933"/>
                 <w:kern w:val="0"/>
                 <w:sz w:val="21"/>
                 <w:szCs w:val="22"/>
-                <w:lang w:val="en-US" w:eastAsia="en-US" w:bidi="ar-SA"/>
               </w:rPr>
               <w:t>Open to learners (5)</w:t>
             </w:r>
@@ -707,7 +1134,18 @@
         <w:tc>
           <w:tcPr>
             <w:tcW w:w="7671" w:type="dxa"/>
-            <w:tcBorders/>
+            <w:tcBorders>
+              <w:top w:val="single" w:sz="4" w:space="0" w:color="auto"/>
+              <w:left w:val="single" w:sz="4" w:space="0" w:color="auto"/>
+              <w:bottom w:val="single" w:sz="4" w:space="0" w:color="auto"/>
+              <w:right w:val="single" w:sz="4" w:space="0" w:color="auto"/>
+            </w:tcBorders>
+            <w:tcMar>
+              <w:top w:w="0" w:type="dxa"/>
+              <w:left w:w="108" w:type="dxa"/>
+              <w:bottom w:w="0" w:type="dxa"/>
+              <w:right w:w="108" w:type="dxa"/>
+            </w:tcMar>
           </w:tcPr>
           <w:p>
             <w:pPr>
@@ -715,20 +1153,18 @@
               <w:widowControl/>
               <w:jc w:val="start"/>
               <w:rPr>
-                <w:rFonts w:eastAsia="ＭＳ 明朝" w:cs=""/>
+                <w:rFonts w:eastAsia="ＭＳ 明朝"/>
                 <w:kern w:val="0"/>
                 <w:szCs w:val="22"/>
-                <w:lang w:val="en-US" w:eastAsia="en-US" w:bidi="ar-SA"/>
               </w:rPr>
             </w:pPr>
             <w:r>
               <w:rPr>
-                <w:rFonts w:eastAsia="ＭＳ 明朝" w:cs=""/>
-                <w:b w:val="false"/>
+                <w:rFonts w:ascii="Calibri" w:hAnsi="Calibri" w:eastAsia="ＭＳ 明朝" w:cs="Calibri"/>
+                <w:color w:val="1F2933"/>
                 <w:kern w:val="0"/>
                 <w:sz w:val="21"/>
                 <w:szCs w:val="22"/>
-                <w:lang w:val="en-US" w:eastAsia="en-US" w:bidi="ar-SA"/>
               </w:rPr>
               <w:t>A genuine entry point (low floor) and enough ceiling to hold real depth. Nobody locked out, nobody out of task.</w:t>
             </w:r>
@@ -736,11 +1172,21 @@
         </w:tc>
       </w:tr>
       <w:tr>
-        <w:trPr/>
         <w:tc>
           <w:tcPr>
             <w:tcW w:w="1800" w:type="dxa"/>
-            <w:tcBorders/>
+            <w:tcBorders>
+              <w:top w:val="single" w:sz="4" w:space="0" w:color="auto"/>
+              <w:left w:val="single" w:sz="4" w:space="0" w:color="auto"/>
+              <w:bottom w:val="single" w:sz="4" w:space="0" w:color="auto"/>
+              <w:right w:val="single" w:sz="4" w:space="0" w:color="auto"/>
+            </w:tcBorders>
+            <w:tcMar>
+              <w:top w:w="0" w:type="dxa"/>
+              <w:left w:w="108" w:type="dxa"/>
+              <w:bottom w:w="0" w:type="dxa"/>
+              <w:right w:w="108" w:type="dxa"/>
+            </w:tcMar>
           </w:tcPr>
           <w:p>
             <w:pPr>
@@ -748,20 +1194,20 @@
               <w:widowControl/>
               <w:jc w:val="start"/>
               <w:rPr>
-                <w:rFonts w:eastAsia="ＭＳ 明朝" w:cs=""/>
+                <w:rFonts w:eastAsia="ＭＳ 明朝"/>
                 <w:kern w:val="0"/>
                 <w:szCs w:val="22"/>
-                <w:lang w:val="en-US" w:eastAsia="en-US" w:bidi="ar-SA"/>
               </w:rPr>
             </w:pPr>
             <w:r>
               <w:rPr>
-                <w:rFonts w:eastAsia="ＭＳ 明朝" w:cs=""/>
+                <w:rFonts w:ascii="Calibri" w:hAnsi="Calibri" w:eastAsia="ＭＳ 明朝" w:cs="Calibri"/>
                 <w:b/>
+                <w:bCs/>
+                <w:color w:val="1F2933"/>
                 <w:kern w:val="0"/>
                 <w:sz w:val="21"/>
                 <w:szCs w:val="22"/>
-                <w:lang w:val="en-US" w:eastAsia="en-US" w:bidi="ar-SA"/>
               </w:rPr>
               <w:t>Open to strategies (5)</w:t>
             </w:r>
@@ -770,7 +1216,18 @@
         <w:tc>
           <w:tcPr>
             <w:tcW w:w="7671" w:type="dxa"/>
-            <w:tcBorders/>
+            <w:tcBorders>
+              <w:top w:val="single" w:sz="4" w:space="0" w:color="auto"/>
+              <w:left w:val="single" w:sz="4" w:space="0" w:color="auto"/>
+              <w:bottom w:val="single" w:sz="4" w:space="0" w:color="auto"/>
+              <w:right w:val="single" w:sz="4" w:space="0" w:color="auto"/>
+            </w:tcBorders>
+            <w:tcMar>
+              <w:top w:w="0" w:type="dxa"/>
+              <w:left w:w="108" w:type="dxa"/>
+              <w:bottom w:w="0" w:type="dxa"/>
+              <w:right w:w="108" w:type="dxa"/>
+            </w:tcMar>
           </w:tcPr>
           <w:p>
             <w:pPr>
@@ -778,32 +1235,40 @@
               <w:widowControl/>
               <w:jc w:val="start"/>
               <w:rPr>
-                <w:rFonts w:eastAsia="ＭＳ 明朝" w:cs=""/>
+                <w:rFonts w:eastAsia="ＭＳ 明朝"/>
                 <w:kern w:val="0"/>
                 <w:szCs w:val="22"/>
-                <w:lang w:val="en-US" w:eastAsia="en-US" w:bidi="ar-SA"/>
               </w:rPr>
             </w:pPr>
             <w:r>
               <w:rPr>
-                <w:rFonts w:eastAsia="ＭＳ 明朝" w:cs=""/>
-                <w:b w:val="false"/>
+                <w:rFonts w:ascii="Calibri" w:hAnsi="Calibri" w:eastAsia="ＭＳ 明朝" w:cs="Calibri"/>
+                <w:color w:val="1F2933"/>
                 <w:kern w:val="0"/>
                 <w:sz w:val="21"/>
                 <w:szCs w:val="22"/>
-                <w:lang w:val="en-US" w:eastAsia="en-US" w:bidi="ar-SA"/>
               </w:rPr>
-              <w:t>Three anticipated student solutions that are truly distinct in method or representation, not the same procedure three ways. The test of richness.</w:t>
+              <w:t>Three genuinely distinct solution strategies — surfaced by your Field Prep Partner(s) and the published solutions — different in method or representation, not the same procedure three ways. The test of richness.</w:t>
             </w:r>
           </w:p>
         </w:tc>
       </w:tr>
       <w:tr>
-        <w:trPr/>
         <w:tc>
           <w:tcPr>
             <w:tcW w:w="1800" w:type="dxa"/>
-            <w:tcBorders/>
+            <w:tcBorders>
+              <w:top w:val="single" w:sz="4" w:space="0" w:color="auto"/>
+              <w:left w:val="single" w:sz="4" w:space="0" w:color="auto"/>
+              <w:bottom w:val="single" w:sz="4" w:space="0" w:color="auto"/>
+              <w:right w:val="single" w:sz="4" w:space="0" w:color="auto"/>
+            </w:tcBorders>
+            <w:tcMar>
+              <w:top w:w="0" w:type="dxa"/>
+              <w:left w:w="108" w:type="dxa"/>
+              <w:bottom w:w="0" w:type="dxa"/>
+              <w:right w:w="108" w:type="dxa"/>
+            </w:tcMar>
           </w:tcPr>
           <w:p>
             <w:pPr>
@@ -811,20 +1276,20 @@
               <w:widowControl/>
               <w:jc w:val="start"/>
               <w:rPr>
-                <w:rFonts w:eastAsia="ＭＳ 明朝" w:cs=""/>
+                <w:rFonts w:eastAsia="ＭＳ 明朝"/>
                 <w:kern w:val="0"/>
                 <w:szCs w:val="22"/>
-                <w:lang w:val="en-US" w:eastAsia="en-US" w:bidi="ar-SA"/>
               </w:rPr>
             </w:pPr>
             <w:r>
               <w:rPr>
-                <w:rFonts w:eastAsia="ＭＳ 明朝" w:cs=""/>
+                <w:rFonts w:ascii="Calibri" w:hAnsi="Calibri" w:eastAsia="ＭＳ 明朝" w:cs="Calibri"/>
                 <w:b/>
+                <w:bCs/>
+                <w:color w:val="1F2933"/>
                 <w:kern w:val="0"/>
                 <w:sz w:val="21"/>
                 <w:szCs w:val="22"/>
-                <w:lang w:val="en-US" w:eastAsia="en-US" w:bidi="ar-SA"/>
               </w:rPr>
               <w:t>Demands visible reasoning (5)</w:t>
             </w:r>
@@ -833,7 +1298,18 @@
         <w:tc>
           <w:tcPr>
             <w:tcW w:w="7671" w:type="dxa"/>
-            <w:tcBorders/>
+            <w:tcBorders>
+              <w:top w:val="single" w:sz="4" w:space="0" w:color="auto"/>
+              <w:left w:val="single" w:sz="4" w:space="0" w:color="auto"/>
+              <w:bottom w:val="single" w:sz="4" w:space="0" w:color="auto"/>
+              <w:right w:val="single" w:sz="4" w:space="0" w:color="auto"/>
+            </w:tcBorders>
+            <w:tcMar>
+              <w:top w:w="0" w:type="dxa"/>
+              <w:left w:w="108" w:type="dxa"/>
+              <w:bottom w:w="0" w:type="dxa"/>
+              <w:right w:w="108" w:type="dxa"/>
+            </w:tcMar>
           </w:tcPr>
           <w:p>
             <w:pPr>
@@ -841,20 +1317,18 @@
               <w:widowControl/>
               <w:jc w:val="start"/>
               <w:rPr>
-                <w:rFonts w:eastAsia="ＭＳ 明朝" w:cs=""/>
+                <w:rFonts w:eastAsia="ＭＳ 明朝"/>
                 <w:kern w:val="0"/>
                 <w:szCs w:val="22"/>
-                <w:lang w:val="en-US" w:eastAsia="en-US" w:bidi="ar-SA"/>
               </w:rPr>
             </w:pPr>
             <w:r>
               <w:rPr>
-                <w:rFonts w:eastAsia="ＭＳ 明朝" w:cs=""/>
-                <w:b w:val="false"/>
+                <w:rFonts w:ascii="Calibri" w:hAnsi="Calibri" w:eastAsia="ＭＳ 明朝" w:cs="Calibri"/>
+                <w:color w:val="1F2933"/>
                 <w:kern w:val="0"/>
                 <w:sz w:val="21"/>
                 <w:szCs w:val="22"/>
-                <w:lang w:val="en-US" w:eastAsia="en-US" w:bidi="ar-SA"/>
               </w:rPr>
               <w:t>Requires students to show or justify their thinking, so understanding surfaces. Names where your learner might get stuck and what it would reveal.</w:t>
             </w:r>
@@ -862,11 +1336,21 @@
         </w:tc>
       </w:tr>
       <w:tr>
-        <w:trPr/>
         <w:tc>
           <w:tcPr>
             <w:tcW w:w="1800" w:type="dxa"/>
-            <w:tcBorders/>
+            <w:tcBorders>
+              <w:top w:val="single" w:sz="4" w:space="0" w:color="auto"/>
+              <w:left w:val="single" w:sz="4" w:space="0" w:color="auto"/>
+              <w:bottom w:val="single" w:sz="4" w:space="0" w:color="auto"/>
+              <w:right w:val="single" w:sz="4" w:space="0" w:color="auto"/>
+            </w:tcBorders>
+            <w:tcMar>
+              <w:top w:w="0" w:type="dxa"/>
+              <w:left w:w="108" w:type="dxa"/>
+              <w:bottom w:w="0" w:type="dxa"/>
+              <w:right w:w="108" w:type="dxa"/>
+            </w:tcMar>
           </w:tcPr>
           <w:p>
             <w:pPr>
@@ -874,29 +1358,40 @@
               <w:widowControl/>
               <w:jc w:val="start"/>
               <w:rPr>
-                <w:rFonts w:eastAsia="ＭＳ 明朝" w:cs=""/>
+                <w:rFonts w:eastAsia="ＭＳ 明朝"/>
                 <w:kern w:val="0"/>
                 <w:szCs w:val="22"/>
-                <w:lang w:val="en-US" w:eastAsia="en-US" w:bidi="ar-SA"/>
               </w:rPr>
             </w:pPr>
             <w:r>
               <w:rPr>
-                <w:rFonts w:eastAsia="ＭＳ 明朝" w:cs=""/>
+                <w:rFonts w:ascii="Calibri" w:hAnsi="Calibri" w:eastAsia="ＭＳ 明朝" w:cs="Calibri"/>
                 <w:b/>
+                <w:bCs/>
+                <w:color w:val="1F2933"/>
                 <w:kern w:val="0"/>
                 <w:sz w:val="21"/>
                 <w:szCs w:val="22"/>
-                <w:lang w:val="en-US" w:eastAsia="en-US" w:bidi="ar-SA"/>
               </w:rPr>
-              <w:t>Revision trail (5)</w:t>
+              <w:t>Two reads (5)</w:t>
             </w:r>
           </w:p>
         </w:tc>
         <w:tc>
           <w:tcPr>
             <w:tcW w:w="7671" w:type="dxa"/>
-            <w:tcBorders/>
+            <w:tcBorders>
+              <w:top w:val="single" w:sz="4" w:space="0" w:color="auto"/>
+              <w:left w:val="single" w:sz="4" w:space="0" w:color="auto"/>
+              <w:bottom w:val="single" w:sz="4" w:space="0" w:color="auto"/>
+              <w:right w:val="single" w:sz="4" w:space="0" w:color="auto"/>
+            </w:tcBorders>
+            <w:tcMar>
+              <w:top w:w="0" w:type="dxa"/>
+              <w:left w:w="108" w:type="dxa"/>
+              <w:bottom w:w="0" w:type="dxa"/>
+              <w:right w:w="108" w:type="dxa"/>
+            </w:tcMar>
           </w:tcPr>
           <w:p>
             <w:pPr>
@@ -904,94 +1399,200 @@
               <w:widowControl/>
               <w:jc w:val="start"/>
               <w:rPr>
-                <w:rFonts w:eastAsia="ＭＳ 明朝" w:cs=""/>
+                <w:rFonts w:eastAsia="ＭＳ 明朝"/>
                 <w:kern w:val="0"/>
                 <w:szCs w:val="22"/>
-                <w:lang w:val="en-US" w:eastAsia="en-US" w:bidi="ar-SA"/>
               </w:rPr>
             </w:pPr>
             <w:r>
               <w:rPr>
-                <w:rFonts w:eastAsia="ＭＳ 明朝" w:cs=""/>
-                <w:b w:val="false"/>
+                <w:rFonts w:ascii="Calibri" w:hAnsi="Calibri" w:eastAsia="ＭＳ 明朝" w:cs="Calibri"/>
+                <w:color w:val="1F2933"/>
                 <w:kern w:val="0"/>
                 <w:sz w:val="21"/>
                 <w:szCs w:val="22"/>
-                <w:lang w:val="en-US" w:eastAsia="en-US" w:bidi="ar-SA"/>
               </w:rPr>
-              <w:t>Alkimi's feedback, and what you changed and rejected, and why. Critical revision, not blind compliance. This is Document 2.</w:t>
-            </w:r>
-          </w:p>
-        </w:tc>
-      </w:tr>
-      <w:tr>
-        <w:trPr/>
-        <w:tc>
-          <w:tcPr>
-            <w:tcW w:w="1800" w:type="dxa"/>
-            <w:tcBorders/>
-          </w:tcPr>
-          <w:p>
-            <w:pPr>
-              <w:pStyle w:val="Normal"/>
-              <w:widowControl/>
-              <w:jc w:val="start"/>
-              <w:rPr>
-                <w:rFonts w:eastAsia="ＭＳ 明朝" w:cs=""/>
-                <w:kern w:val="0"/>
-                <w:szCs w:val="22"/>
-                <w:lang w:val="en-US" w:eastAsia="en-US" w:bidi="ar-SA"/>
-              </w:rPr>
-            </w:pPr>
-            <w:r>
-              <w:rPr>
-                <w:rFonts w:eastAsia="ＭＳ 明朝" w:cs=""/>
-                <w:b/>
-                <w:kern w:val="0"/>
-                <w:sz w:val="21"/>
-                <w:szCs w:val="22"/>
-                <w:lang w:val="en-US" w:eastAsia="en-US" w:bidi="ar-SA"/>
-              </w:rPr>
-              <w:t>Total (25)</w:t>
-            </w:r>
-          </w:p>
-        </w:tc>
-        <w:tc>
-          <w:tcPr>
-            <w:tcW w:w="7671" w:type="dxa"/>
-            <w:tcBorders/>
-          </w:tcPr>
-          <w:p>
-            <w:pPr>
-              <w:pStyle w:val="Normal"/>
-              <w:widowControl/>
-              <w:jc w:val="start"/>
-              <w:rPr>
-                <w:rFonts w:eastAsia="ＭＳ 明朝" w:cs=""/>
-                <w:kern w:val="0"/>
-                <w:szCs w:val="22"/>
-                <w:lang w:val="en-US" w:eastAsia="en-US" w:bidi="ar-SA"/>
-              </w:rPr>
-            </w:pPr>
-            <w:r>
-              <w:rPr>
-                <w:rFonts w:eastAsia="ＭＳ 明朝" w:cs=""/>
-                <w:kern w:val="0"/>
-                <w:szCs w:val="22"/>
-                <w:lang w:val="en-US" w:eastAsia="en-US" w:bidi="ar-SA"/>
-              </w:rPr>
+              <w:t>Evidence you tested with a human first, then with Alkimi, and revised critically — not blindly — from both. What you changed, what you rejected, and why. This is Document 2.</w:t>
             </w:r>
           </w:p>
         </w:tc>
       </w:tr>
     </w:tbl>
+    <w:p>
+      <w:pPr>
+        <w:spacing w:line="240" w:lineRule="auto"/>
+        <w:jc w:val="start"/>
+      </w:pPr>
+    </w:p>
+    <w:p>
+      <w:pPr>
+        <w:spacing w:line="240" w:lineRule="auto"/>
+      </w:pPr>
+      <w:r>
+        <w:rPr>
+          <w:rFonts w:ascii="Calibri" w:cs="Calibri"/>
+          <w:b/>
+          <w:bCs/>
+          <w:kern w:val="0"/>
+          <w:sz w:val="22"/>
+          <w:szCs w:val="22"/>
+        </w:rPr>
+        <w:t>The Prompt to Give Alkimi</w:t>
+      </w:r>
+    </w:p>
+    <w:p>
+      <w:pPr>
+        <w:pStyle w:val="Normal"/>
+        <w:spacing w:line="240" w:lineRule="auto"/>
+        <w:jc w:val="start"/>
+      </w:pPr>
+      <w:r>
+        <w:rPr>
+          <w:rFonts w:ascii="Calibri" w:cs="Calibri"/>
+          <w:kern w:val="0"/>
+          <w:sz w:val="22"/>
+          <w:szCs w:val="22"/>
+        </w:rPr>
+        <w:t>Paste your task, the grade level, and your research question. Then give Alkimi this prompt:</w:t>
+      </w:r>
+    </w:p>
+    <w:p>
+      <w:pPr>
+        <w:pStyle w:val="Normal"/>
+        <w:spacing w:before="60" w:line="240" w:lineRule="auto"/>
+        <w:ind w:left="360"/>
+        <w:jc w:val="start"/>
+      </w:pPr>
+      <w:r>
+        <w:rPr>
+          <w:rFonts w:ascii="Calibri" w:cs="Calibri"/>
+          <w:i/>
+          <w:iCs/>
+          <w:kern w:val="0"/>
+          <w:sz w:val="22"/>
+          <w:szCs w:val="22"/>
+        </w:rPr>
+        <w:t>You are a critical friend helping me judge a mathematics task I designed for one student. Do not rewrite the task or invent a new one — test the one I give you and point at what to fix.</w:t>
+      </w:r>
+    </w:p>
+    <w:p>
+      <w:pPr>
+        <w:pStyle w:val="Normal"/>
+        <w:spacing w:line="240" w:lineRule="auto"/>
+        <w:ind w:left="360"/>
+        <w:jc w:val="start"/>
+      </w:pPr>
+      <w:r>
+        <w:rPr>
+          <w:rFonts w:ascii="Calibri" w:cs="Calibri"/>
+          <w:i/>
+          <w:iCs/>
+          <w:kern w:val="0"/>
+          <w:sz w:val="22"/>
+          <w:szCs w:val="22"/>
+        </w:rPr>
+        <w:t>Answer four things, plainly and honestly:</w:t>
+      </w:r>
+    </w:p>
+    <w:p>
+      <w:pPr>
+        <w:pStyle w:val="Normal"/>
+        <w:spacing w:line="240" w:lineRule="auto"/>
+        <w:ind w:left="360"/>
+        <w:jc w:val="start"/>
+      </w:pPr>
+      <w:r>
+        <w:rPr>
+          <w:rFonts w:ascii="Calibri" w:cs="Calibri"/>
+          <w:i/>
+          <w:iCs/>
+          <w:kern w:val="0"/>
+          <w:sz w:val="22"/>
+          <w:szCs w:val="22"/>
+        </w:rPr>
+        <w:t>1. What are all the genuinely different ways a student at this grade might solve this? List the strategies and representations.</w:t>
+      </w:r>
+    </w:p>
+    <w:p>
+      <w:pPr>
+        <w:pStyle w:val="Normal"/>
+        <w:spacing w:line="240" w:lineRule="auto"/>
+        <w:ind w:left="360"/>
+        <w:jc w:val="start"/>
+      </w:pPr>
+      <w:r>
+        <w:rPr>
+          <w:rFonts w:ascii="Calibri" w:cs="Calibri"/>
+          <w:i/>
+          <w:iCs/>
+          <w:kern w:val="0"/>
+          <w:sz w:val="22"/>
+          <w:szCs w:val="22"/>
+        </w:rPr>
+        <w:t>2. Is that range wide enough for the task to be truly open to strategies, or does it funnel everyone toward one method?</w:t>
+      </w:r>
+    </w:p>
+    <w:p>
+      <w:pPr>
+        <w:pStyle w:val="Normal"/>
+        <w:spacing w:line="240" w:lineRule="auto"/>
+        <w:ind w:left="360"/>
+        <w:jc w:val="start"/>
+      </w:pPr>
+      <w:r>
+        <w:rPr>
+          <w:rFonts w:ascii="Calibri" w:cs="Calibri"/>
+          <w:i/>
+          <w:iCs/>
+          <w:kern w:val="0"/>
+          <w:sz w:val="22"/>
+          <w:szCs w:val="22"/>
+        </w:rPr>
+        <w:t>3. Where could a student finish this without showing the thinking my research question is about? Name the spots.</w:t>
+      </w:r>
+    </w:p>
+    <w:p>
+      <w:pPr>
+        <w:pStyle w:val="Normal"/>
+        <w:spacing w:line="240" w:lineRule="auto"/>
+        <w:ind w:left="360"/>
+        <w:jc w:val="start"/>
+      </w:pPr>
+      <w:r>
+        <w:rPr>
+          <w:rFonts w:ascii="Calibri" w:cs="Calibri"/>
+          <w:i/>
+          <w:iCs/>
+          <w:kern w:val="0"/>
+          <w:sz w:val="22"/>
+          <w:szCs w:val="22"/>
+        </w:rPr>
+        <w:t>4. What one or two changes would make it stronger?</w:t>
+      </w:r>
+    </w:p>
+    <w:p>
+      <w:pPr>
+        <w:pStyle w:val="Normal"/>
+        <w:spacing w:line="240" w:lineRule="auto"/>
+        <w:ind w:left="360"/>
+        <w:jc w:val="start"/>
+      </w:pPr>
+      <w:r>
+        <w:rPr>
+          <w:rFonts w:ascii="Calibri" w:cs="Calibri"/>
+          <w:i/>
+          <w:iCs/>
+          <w:kern w:val="0"/>
+          <w:sz w:val="22"/>
+          <w:szCs w:val="22"/>
+        </w:rPr>
+        <w:t>Treat the strategies you list as possibilities to watch for with a real child, not facts about how children think. If the task is weak, say so.</w:t>
+      </w:r>
+    </w:p>
     <w:sectPr>
       <w:type w:val="nextPage"/>
       <w:pgSz w:w="12240" w:h="15840"/>
-      <w:pgMar w:left="1296" w:right="1296" w:gutter="0" w:header="0" w:top="1008" w:footer="0" w:bottom="1008"/>
-      <w:pgNumType w:fmt="decimal"/>
-      <w:formProt w:val="false"/>
-      <w:textDirection w:val="lrTb"/>
+      <w:pgMar w:top="1008" w:right="1296" w:bottom="1008" w:left="1296" w:header="0" w:footer="0" w:gutter="0"/>
       <w:docGrid w:type="default" w:linePitch="360" w:charSpace="0"/>
     </w:sectPr>
   </w:body>

</xml_diff>